<commit_message>
Add the Session 02 presenter page; tighten Session 02 build prompts
The page follows the Session 01 format (Read/Present, terminal bands, copy
buttons): the tool boundary, error vocabulary, exact approval and the effect
ledger, MCP roles and real discovery output, one call traced through MCP,
the four build steps with excerpts from lesson-02, the exercise,
verification and recovery prompts.

Build steps 1, 2 and 4 now name the shapes the Lesson 02 check pack
imports, including ApprovalRequired in incident/core.py, which no prompt
asked for.

Co-Authored-By: Claude Opus 5.5 <noreply@anthropic.com>
Claude-Session: https://claude.ai/code/session_0123W63ZaDAAnYHCFqarTnbL
</commit_message>
<xml_diff>
--- a/L3 2026 Agentic Platform Instructor Materials/instructor-guides/02 Reliable tools and MCP integration.docx
+++ b/L3 2026 Agentic Platform Instructor Materials/instructor-guides/02 Reliable tools and MCP integration.docx
@@ -1806,7 +1806,7 @@
         <w:t xml:space="preserve">PROMPT </w:t>
       </w:r>
       <w:r>
-        <w:t>For Lesson 02, continue in my learner project. Implement ToolExecutor in incident/tools.py. Check tool existence, application-owned capabilities and JSON arguments before dispatch. Reject unexpected tenant arguments and oversized results. Return structured errors that distinguish terminal failures from retryable read failures. Preserve the existing agent loop. Demonstrate malformed arguments and an unauthorized write proposal being rejected before a handler performs an effect. Build to the interfaces the Lesson 02 check pack uses, and do not edit the check pack or the given files. Preserve earlier behaviour, run relevant checks and show the change and observed evidence. Stop at this step.</w:t>
+        <w:t>For Lesson 02, continue in my learner project. Implement ToolExecutor in incident/tools.py. Check tool existence, application-owned capabilities and JSON arguments before dispatch. Reject unexpected tenant arguments and oversized results. Return structured errors that distinguish terminal failures from retryable read failures. Preserve the existing agent loop. Demonstrate malformed arguments and an unauthorized write proposal being rejected before a handler performs an effect. The check pack needs ToolExecutor(db=":memory:", read_handler=simple_tools, output_limit=6000), whose output_limit attribute a test changes; available(context), which returns only the schemas the context allows; and async execute(name, args, context), which returns the handler's result or {"ok": false, "error": code, "retryable": true or false}. Use the codes unknown_tool, permission_denied, invalid_arguments and output_too_large (all terminal), and tool_unavailable (retryable) when a read still times out or loses its connection after one retry. Check the permission before validating the arguments. Build to the interfaces the Lesson 02 check pack uses, and do not edit the check pack or the given files. Preserve earlier behaviour, run relevant checks and show the change and observed evidence. Stop at this step.</w:t>
       </w:r>
     </w:p>
     <w:p>
@@ -1952,7 +1952,7 @@
         <w:t xml:space="preserve">PROMPT </w:t>
       </w:r>
       <w:r>
-        <w:t>For Lesson 02, continue in my learner project. Add exact-action approval and idempotent mock remediation to ToolExecutor. Bind the action key to tenant, run, tool name and canonical arguments. Commit the local mock effect and its deduplication record atomically in SQLite. Test the same approved write after reopening the executor and test changed arguments against the original approval. Show that only one local effect exists, and explain the limit of this guarantee for external APIs. Build to the interfaces the Lesson 02 check pack uses, and do not edit the check pack or the given files. Preserve earlier behaviour, run relevant checks and show the change and observed evidence. Stop at this step.</w:t>
+        <w:t>For Lesson 02, continue in my learner project. Add exact-action approval and idempotent mock remediation to ToolExecutor. Add a mock_remediate tool schema with incident_id (INC- followed by three digits) and action (only rollback), and define ApprovalRequired in incident/core.py: an exception whose action attribute holds the proposed key, name and args. action_key(name, args, context) returns the key; execute raises ApprovalRequired when that key is not in context.approved, and an approved write returns its result with replayed false the first time and the stored result with replayed true after that. Bind the action key to tenant, run, tool name and canonical arguments. Commit the local mock effect and its deduplication record atomically in SQLite. Test the same approved write after reopening the executor and test changed arguments against the original approval. Show that only one local effect exists, and explain the limit of this guarantee for external APIs. Build to the interfaces the Lesson 02 check pack uses, and do not edit the check pack or the given files. Preserve earlier behaviour, run relevant checks and show the change and observed evidence. Stop at this step.</w:t>
       </w:r>
     </w:p>
     <w:p>
@@ -2212,7 +2212,7 @@
         <w:t xml:space="preserve">PROMPT </w:t>
       </w:r>
       <w:r>
-        <w:t>For Lesson 02, continue in my learner project. Implement the MCP read adapter and connect it behind ToolExecutor. Use the real local stdio transport and the pinned SDK's result shapes. Make the Session 02 check pack pass, show the negotiated protocol and discovered tools, and run the same investigation through the adapter. Confirm that transport discovery does not grant new permissions and show the unchanged cited outcome. Build to the interfaces the Lesson 02 check pack uses, and do not edit the check pack or the given files. Preserve earlier behaviour, run relevant checks and show the change and observed evidence. Stop at this step.</w:t>
+        <w:t>For Lesson 02, continue in my learner project. Implement the MCP read adapter and connect it behind ToolExecutor. The check pack needs stdio_client(tenant="astro"), which returns the pinned SDK's Client for a server started as python -m incident.mcp_bridge with INCIDENT_TENANT set by the launcher, and MCPReadAdapter(client), a read handler that returns the result's structured content when present and otherwise parses its JSON text content. Use the real local stdio transport and the pinned SDK's result shapes. Make the Session 02 check pack pass, show the negotiated protocol and discovered tools, and run the same investigation through the adapter. Confirm that transport discovery does not grant new permissions and show the unchanged cited outcome. Build to the interfaces the Lesson 02 check pack uses, and do not edit the check pack or the given files. Preserve earlier behaviour, run relevant checks and show the change and observed evidence. Stop at this step.</w:t>
       </w:r>
     </w:p>
     <w:p>

</xml_diff>

<commit_message>
Lesson 02: fix the prompt gaps found by the learner dry run
From an isolated dry run that reached 12 passed from the kit alone:
- step 1 names the shell's needs (ToolExecutor() with defaults, a schemas attribute) and
  demonstrates a not-granted tool instead of a write tool that step 2 adds;
- step 2 uses ApprovalRequired, adding it only if missing;
- step 3 says exactly what the MCP server serves;
- step 4 asks for a lost MCP connection to come back as tool_unavailable and shows the
  protocol with a script, since course.lab 2 runs only after the verify step;
- the exercise says the replay stays in the script and the Overview reads lesson-01 until verify;
- the kit README lists the shell's interface and what can run when; the page gains Expect lines
  for steps 1 and 3.

Co-Authored-By: Claude Opus 5.5 <noreply@anthropic.com>
Claude-Session: https://claude.ai/code/session_0123W63ZaDAAnYHCFqarTnbL
</commit_message>
<xml_diff>
--- a/L3 2026 Agentic Platform Instructor Materials/instructor-guides/02 Reliable tools and MCP integration.docx
+++ b/L3 2026 Agentic Platform Instructor Materials/instructor-guides/02 Reliable tools and MCP integration.docx
@@ -1826,7 +1826,7 @@
         <w:t xml:space="preserve">PROMPT </w:t>
       </w:r>
       <w:r>
-        <w:t>For Lesson 02, continue in my learner project. Implement ToolExecutor in agent_runtime/tools.py. Check tool existence, application-owned capabilities and JSON arguments before dispatch. Reject unexpected tenant arguments and oversized results. Return structured errors that distinguish terminal failures from retryable read failures. Preserve the existing agent loop. Demonstrate malformed arguments and an unauthorized write proposal being rejected before a handler performs an effect. The check pack needs ToolExecutor(db=":memory:", read_handler=simple_tools, output_limit=6000), whose output_limit attribute a test changes; available(context), which returns only the schemas the context allows; and async execute(name, args, context), which returns the handler's result or {"ok": false, "error": code, "retryable": true or false}. Use the codes unknown_tool, permission_denied, invalid_arguments and output_too_large (all terminal), and tool_unavailable (retryable) when a read still times out or loses its connection after one retry. Check the permission before validating the arguments. Build to the interfaces the Lesson 02 check pack uses, and do not edit the check pack or the given files. Preserve earlier behaviour, run relevant checks and show the change and observed evidence. Stop at this step.</w:t>
+        <w:t>For Lesson 02, continue in my learner project. Implement ToolExecutor in agent_runtime/tools.py. Check tool existence, application-owned capabilities and JSON arguments before dispatch. Reject unexpected tenant arguments and oversized results. Return structured errors that distinguish terminal failures from retryable read failures. Preserve the existing agent loop. Demonstrate malformed arguments and a tool the run was not granted being rejected before a handler runs. The check pack needs ToolExecutor(db=":memory:", read_handler=simple_tools, output_limit=6000), whose output_limit attribute a test changes; available(context), which returns only the schemas the context allows; and async execute(name, args, context), which returns the handler's result or {"ok": false, "error": code, "retryable": true or false}. Use the codes unknown_tool, permission_denied, invalid_arguments and output_too_large (all terminal), and tool_unavailable (retryable) when a read still times out or loses its connection after one retry. Check the permission before validating the arguments. The given platform shell also creates ToolExecutor() with no arguments, so give every parameter a default (an in-memory database and the Session 01 readers), and it lists the tool catalogue from a schemas attribute: every tool the executor knows, which gains mock_remediate in the next step. This lesson's test file cannot import until action_key exists in the next step, so check this step with your demonstration and the Session 01 tests. Build to the interfaces the Lesson 02 check pack uses, and do not edit the check pack or the given files. Preserve earlier behaviour, run relevant checks and show the change and observed evidence. Stop at this step.</w:t>
       </w:r>
     </w:p>
     <w:p>
@@ -1972,7 +1972,7 @@
         <w:t xml:space="preserve">PROMPT </w:t>
       </w:r>
       <w:r>
-        <w:t>For Lesson 02, continue in my learner project. Add exact-action approval and idempotent mock remediation to ToolExecutor. Add a mock_remediate tool schema with incident_id (INC- followed by three digits) and action (only rollback), and define ApprovalRequired in agent_runtime/core.py: an exception whose action attribute holds the proposed key, name and args. action_key(name, args, context) returns the key; execute raises ApprovalRequired when that key is not in context.approved, and an approved write returns its result with replayed false the first time and the stored result with replayed true after that. Bind the action key to tenant, run, tool name and canonical arguments. Commit the local mock effect and its deduplication record atomically in SQLite. Test the same approved write after reopening the executor and test changed arguments against the original approval. Show that only one local effect exists, and explain the limit of this guarantee for external APIs. Build to the interfaces the Lesson 02 check pack uses, and do not edit the check pack or the given files. Preserve earlier behaviour, run relevant checks and show the change and observed evidence. Stop at this step.</w:t>
+        <w:t>For Lesson 02, continue in my learner project. Add exact-action approval and idempotent mock remediation to ToolExecutor. Add a mock_remediate tool schema with incident_id (INC- followed by three digits) and action (only rollback), and add it to schemas. Use ApprovalRequired in agent_runtime/core.py, adding it if your core does not have it yet: an exception whose action attribute holds the proposed key, name and args. action_key(name, args, context) returns the key; execute raises ApprovalRequired when that key is not in context.approved, and an approved write returns its result with replayed false the first time and the stored result with replayed true after that. Bind the action key to tenant, run, tool name and canonical arguments. Commit the local mock effect and its deduplication record atomically in SQLite. Test the same approved write after reopening the executor and test changed arguments against the original approval. Show that only one local effect exists, and explain the limit of this guarantee for external APIs. Build to the interfaces the Lesson 02 check pack uses, and do not edit the check pack or the given files. Preserve earlier behaviour, run relevant checks and show the change and observed evidence. Stop at this step.</w:t>
       </w:r>
     </w:p>
     <w:p>
@@ -2088,7 +2088,7 @@
         <w:t xml:space="preserve">PROMPT </w:t>
       </w:r>
       <w:r>
-        <w:t>For Lesson 02, continue in my learner project. Implement the MCP server in agent_runtime/mcp_bridge.py with the pinned SDK. Expose the existing tenant-scoped log and runbook readers plus the runbook resource. Bind tenant identity in trusted launcher configuration, keep protocol stdout clean, and limit the server to the capabilities required by this lesson. Explain the host, client, server and resource roles before demonstrating discovery. Build to the interfaces the Lesson 02 check pack uses, and do not edit the check pack or the given files. Preserve earlier behaviour, run relevant checks and show the change and observed evidence. Stop at this step.</w:t>
+        <w:t>For Lesson 02, continue in my learner project. Implement the MCP server in agent_runtime/mcp_bridge.py with the pinned SDK. Expose the existing tenant-scoped log and runbook readers plus the runbook resource. Bind tenant identity in trusted launcher configuration, keep protocol stdout clean, and serve only the two read tools and the runbook resource: no write tool and no prompts. If the pinned SDK still advertises an empty capability, report it rather than working around it. Explain the host, client, server and resource roles before demonstrating discovery. Build to the interfaces the Lesson 02 check pack uses, and do not edit the check pack or the given files. Preserve earlier behaviour, run relevant checks and show the change and observed evidence. Stop at this step.</w:t>
       </w:r>
     </w:p>
     <w:p>
@@ -2232,7 +2232,7 @@
         <w:t xml:space="preserve">PROMPT </w:t>
       </w:r>
       <w:r>
-        <w:t>For Lesson 02, continue in my learner project. Implement the MCP read adapter and connect it behind ToolExecutor. The check pack needs stdio_client(tenant="astro"), which returns the pinned SDK's Client for a server started as python -m agent_runtime.mcp_bridge with INCIDENT_TENANT set by the launcher, and MCPReadAdapter(client), a read handler that returns the result's structured content when present and otherwise parses its JSON text content. Use the real local stdio transport and the pinned SDK's result shapes. Make the Session 02 check pack pass, show the negotiated protocol and discovered tools, and run the same investigation through the adapter. Confirm that transport discovery does not grant new permissions and show the unchanged cited outcome. Build to the interfaces the Lesson 02 check pack uses, and do not edit the check pack or the given files. Preserve earlier behaviour, run relevant checks and show the change and observed evidence. Stop at this step.</w:t>
+        <w:t>For Lesson 02, continue in my learner project. Implement the MCP read adapter and connect it behind ToolExecutor. The check pack needs stdio_client(tenant="astro"), which returns the pinned SDK's Client for a server started as python -m agent_runtime.mcp_bridge with INCIDENT_TENANT set by the launcher, and MCPReadAdapter(client), a read handler that returns the result's structured content when present and otherwise parses its JSON text content. Use the real local stdio transport and the pinned SDK's result shapes. A lost or closed MCP connection must reach ToolExecutor as a retryable read failure, so the executor returns tool_unavailable; the pinned SDK does not raise ConnectionError for it, so check what it does raise and show the result by stopping the server. Make the Session 02 check pack pass, show the negotiated protocol and discovered tools with your own short script (python -m course.lab 2 runs only once the verify step raises LESSON), and run the same investigation through the adapter. Confirm that transport discovery does not grant new permissions and show the unchanged cited outcome. Build to the interfaces the Lesson 02 check pack uses, and do not edit the check pack or the given files. Preserve earlier behaviour, run relevant checks and show the change and observed evidence. Stop at this step.</w:t>
       </w:r>
     </w:p>
     <w:p>
@@ -2342,7 +2342,7 @@
         <w:t xml:space="preserve">PROMPT </w:t>
       </w:r>
       <w:r>
-        <w:t>Help me carry out the Lesson 02 learner exercise in my existing project: Add an unexpected tenant argument to a log request, call mock_remediate with a read-only Context, lower output_limit, and repeat an approved mock write after reopening the SQLite executor. Record the error category or replay behaviour for each case. Then start the platform API on loopback with the offline provider and give me the console address: I will sign in as demo-astro and then demo-operator, submit INC-001 in Runs, and repeat the denied and approval cases in the Tools view. First state the expected outcomes, then run the experiment in a throwaway script outside tests/, or from a clean Git state you can restore. Show the observed results and explain any discrepancy. Keep the original acceptance criteria and restore temporary experiments when finished.</w:t>
+        <w:t>Help me carry out the Lesson 02 learner exercise in my existing project: Add an unexpected tenant argument to a log request, call mock_remediate with a read-only Context, lower output_limit, and repeat an approved mock write after reopening the SQLite executor. Record the error category or replay behaviour for each case; the replay case stays in the script, because the console's Tools view never approves a write. Then start the platform API on loopback with the offline provider and give me the console address: I will sign in as demo-astro and then demo-operator, submit INC-001 in Runs, and repeat the denied and approval cases in the Tools view. Tell me that console runs use the in-process readers rather than MCP, and that the Overview shows checkpoint lesson-01 until the verify step raises LESSON. First state the expected outcomes, then run the experiment in a throwaway script outside tests/, or from a clean Git state you can restore. Show the observed results and explain any discrepancy. Keep the original acceptance criteria and restore temporary experiments when finished.</w:t>
       </w:r>
     </w:p>
     <w:p>

</xml_diff>

<commit_message>
Learners keep an AGENTS.md briefing from Lesson 02
The Lesson 02 kit gains AGENTS.template.md (project, layout, rules, how to run it, and a factual
progress log), outside given/ so the check-pack copy never overwrites it. The move-and-start
prompt adds it with the Lesson 01 entry (plus a pointer file such as CLAUDE.md where the agent
needs one); the shared Prepare prompt (Lessons 02-12) reads it first, and the shared Verify prompt
(Lessons 02-12) appends one entry with only observed facts. Session 01 is unchanged.

Co-Authored-By: Claude Opus 5.5 <noreply@anthropic.com>
Claude-Session: https://claude.ai/code/session_0123W63ZaDAAnYHCFqarTnbL
</commit_message>
<xml_diff>
--- a/L3 2026 Agentic Platform Instructor Materials/instructor-guides/02 Reliable tools and MCP integration.docx
+++ b/L3 2026 Agentic Platform Instructor Materials/instructor-guides/02 Reliable tools and MCP integration.docx
@@ -1045,12 +1045,12 @@
         <w:t xml:space="preserve">PROMPT </w:t>
       </w:r>
       <w:r>
-        <w:t>Prepare my learner project for Lesson 02. Open my project repository in my course GitLab group on gitlab.ciklum.net, cloning it into ~/agentic-course/my-platform if it is not there, and confirm it holds my completed lesson-01 work with all its checks passing. Update my read-only copy of the course repository in ~/agentic-course/course, cloning it from https://github.com/maxvpavlov/ciklum-innovate-l3-2026 if it is missing, and tell me the commit it was at before and after the update and which files under learner-kit/lessons/02 changed; its learner-kit folder is the course kit. Use the pinned Python 3.12 environment and the offline mock provider. Do not add this lesson's work yet. Report the project location, its current checkpoint, the test results and any missing prerequisites. Do not ask me to run terminal commands.</w:t>
+        <w:t>Prepare my learner project for Lesson 02. Open my project repository in my course GitLab group on gitlab.ciklum.net, cloning it into ~/agentic-course/my-platform if it is not there, read its AGENTS.md first if it has one and follow it, and confirm it holds my completed lesson-01 work with all its checks passing. Update my read-only copy of the course repository in ~/agentic-course/course, cloning it from https://github.com/maxvpavlov/ciklum-innovate-l3-2026 if it is missing, and tell me the commit it was at before and after the update and which files under learner-kit/lessons/02 changed; its learner-kit folder is the course kit. Use the pinned Python 3.12 environment and the offline mock provider. Do not add this lesson's work yet. Report the project location, its current checkpoint, the test results and any missing prerequisites. Do not ask me to run terminal commands.</w:t>
       </w:r>
     </w:p>
     <w:p>
       <w:r>
-        <w:t>Lesson 01 projects keep everything in incident/. Before the check pack, one prompt moves the project to the layout it keeps from now on (the agent runtime in agent_runtime/, the course scaffolding in course/), copies the given platform shell into agentic_platform/ and starts it. Learners sign in and see their own Lesson 01 agent run INC-001 in the console; the Tools view says the tool boundary is not built yet, which is this session's work.</w:t>
+        <w:t>Lesson 01 projects keep everything in incident/. Before the check pack, one prompt moves the project to the layout it keeps from now on (the agent runtime in agent_runtime/, the course scaffolding in course/), copies the given platform shell into agentic_platform/, adds AGENTS.md (the briefing every later coding-agent session reads first) and starts the platform. Learners sign in and see their own Lesson 01 agent run INC-001 in the console; the Tools view says the tool boundary is not built yet, which is this session's work.</w:t>
       </w:r>
     </w:p>
     <w:p>
@@ -1065,7 +1065,7 @@
         <w:t xml:space="preserve">PROMPT </w:t>
       </w:r>
       <w:r>
-        <w:t>Move my learner project to the course layout and start the platform, without adding this lesson's work, as the first section of learner-kit/lessons/02/README.md in the course repository describes. Move incident/core.py and incident/providers.py into a new agent_runtime/ package, and incident/__init__.py with my LESSON value, incident/lab.py and incident/fixtures.py into a new course/ package. Replace my tests with test_setup.py and test_lesson01.py from learner-kit/lessons/02/checks/tests, and incident/labs/ with __init__.py and l01.py from learner-kit/lessons/02/checks/course/labs, unchanged. Update the imports in my own modules, remove the empty incident/ folder, run the full test suite, which must still report 7 passed, and commit the move on its own. Then copy the given platform shell, everything under learner-kit/lessons/02/given/agentic_platform, into a top-level agentic_platform/ folder unchanged and commit it on its own. Start the platform API on loopback with the offline mock provider, keep it running and give me the console address: I will sign in as demo-astro, submit INC-001 in Runs and open the Tools view. Tell me how to stop it.</w:t>
+        <w:t>Move my learner project to the course layout and start the platform, without adding this lesson's work, as the first section of learner-kit/lessons/02/README.md in the course repository describes. Move incident/core.py and incident/providers.py into a new agent_runtime/ package, and incident/__init__.py with my LESSON value, incident/lab.py and incident/fixtures.py into a new course/ package. Replace my tests with test_setup.py and test_lesson01.py from learner-kit/lessons/02/checks/tests, and incident/labs/ with __init__.py and l01.py from learner-kit/lessons/02/checks/course/labs, unchanged. Update the imports in my own modules, remove the empty incident/ folder, run the full test suite, which must still report 7 passed, and commit the move on its own. Then copy the given platform shell, everything under learner-kit/lessons/02/given/agentic_platform, into a top-level agentic_platform/ folder unchanged and commit it on its own. Then add learner-kit/lessons/02/AGENTS.template.md to my project root as AGENTS.md, fill in its Lesson 01 entry from my checkpoint and the test result you just saw, add a pointer file if your tool reads a different instruction file (for Claude Code, a CLAUDE.md containing @AGENTS.md), and commit that on its own. Start the platform API on loopback with the offline mock provider, keep it running and give me the console address: I will sign in as demo-astro, submit INC-001 in Runs and open the Tools view. Tell me how to stop it.</w:t>
       </w:r>
     </w:p>
     <w:p>
@@ -2368,7 +2368,7 @@
         <w:t xml:space="preserve">PROMPT </w:t>
       </w:r>
       <w:r>
-        <w:t>Verify my Lesson 02 implementation against its completion criteria. Update the checkpoint indicator in course/__init__.py to 2 only when the required capability is present. Run the full test suite, which includes the Lesson 02 check pack and every earlier lesson's tests, and then the Session 02 demonstration with python -m course.lab 2, all unchanged and using the offline provider (MODEL_PROVIDER unset or set to mock). Confirm that the passing count matches the one in the Lesson 02 check pack README. Keep the expected outcomes unchanged. Report checks actually executed, failures, relevant output and any untested integration. Explain the result, then commit my work and push it to my repository on gitlab.ciklum.net; if glab is also signed in to other GitLab hosts, make sure the push goes to gitlab.ciklum.net. Do not equate an unrun or skipped check with a pass.</w:t>
+        <w:t>Verify my Lesson 02 implementation against its completion criteria. Update the checkpoint indicator in course/__init__.py to 2 only when the required capability is present. Run the full test suite, which includes the Lesson 02 check pack and every earlier lesson's tests, and then the Session 02 demonstration with python -m course.lab 2, all unchanged and using the offline provider (MODEL_PROVIDER unset or set to mock). Confirm that the passing count matches the one in the Lesson 02 check pack README. Keep the expected outcomes unchanged. Report checks actually executed, failures, relevant output and any untested integration. Explain the result. When the checks pass, add this lesson's entry to the progress log in AGENTS.md: the checkpoint, the test result you observed and what the lesson added, named as in the Lesson 02 check pack README, and nothing you did not see. Then commit my work and push it to my repository on gitlab.ciklum.net; if glab is also signed in to other GitLab hosts, make sure the push goes to gitlab.ciklum.net. Do not equate an unrun or skipped check with a pass.</w:t>
       </w:r>
     </w:p>
     <w:p>

</xml_diff>